<commit_message>
Document live deployment results
</commit_message>
<xml_diff>
--- a/docs/CampusBudget_Project_Report.docx
+++ b/docs/CampusBudget_Project_Report.docx
@@ -318,7 +318,7 @@
           <w:color w:val="222222"/>
           <w:sz w:val="21"/>
         </w:rPr>
-        <w:t xml:space="preserve">Local verification has produced five passing backend tests and a successful production client build. An Atlas-backed integration test passed registration, authentication, expense CRUD, filters, budget calculations, and cross-user access checks. A browser walkthrough passed account creation, a monthly budget </w:t>
+        <w:t>Local verification produced five passing backend tests and a successful production client build. Atlas-backed integration covered registration, authentication, expense CRUD, filters, budget calculations, and cross-user access checks. CampusBudget is published on GitHub at https://github.com/raneeshxstudy-a11y/CampusBudget and live on Render at https://campusbudget-jztx.onrender.com. Live browser checks passed registration, budget save, expense creation, editing, deletion, search, dashboard totals, and budget-card navigation. Mobile and keyboard review remain pending.</w:t>
       </w:r>
       <w:proofErr w:type="gramStart"/>
       <w:r>
@@ -327,7 +327,6 @@
           <w:color w:val="222222"/>
           <w:sz w:val="21"/>
         </w:rPr>
-        <w:t>save</w:t>
       </w:r>
       <w:proofErr w:type="gramEnd"/>
       <w:r>
@@ -336,7 +335,6 @@
           <w:color w:val="222222"/>
           <w:sz w:val="21"/>
         </w:rPr>
-        <w:t>, expense creation and edit, and dashboard recalculation. The GitHub repository, Render deployment, and live-site evidence remain pending at the time of this report.</w:t>
       </w:r>
     </w:p>
     <w:p>
@@ -721,7 +719,7 @@
           <w:color w:val="222222"/>
           <w:sz w:val="21"/>
         </w:rPr>
-        <w:t>Run automated and Atlas-backed API tests, a frontend build, and a browser walkthrough; record pending checks honestly.</w:t>
+        <w:t>Run automated and Atlas-backed API tests, a frontend build, and a live browser walkthrough; record results and remaining checks accurately.</w:t>
       </w:r>
     </w:p>
     <w:p>
@@ -873,7 +871,7 @@
           <w:color w:val="222222"/>
           <w:sz w:val="21"/>
         </w:rPr>
-        <w:t>Git-ready documentation, local build verification, test evidence, and deployment preparation.</w:t>
+        <w:t>Published GitHub repository, working Render service, local build verification, and live browser evidence.</w:t>
       </w:r>
     </w:p>
     <w:p>
@@ -1728,7 +1726,7 @@
           <w:color w:val="222222"/>
           <w:sz w:val="21"/>
         </w:rPr>
-        <w:t xml:space="preserve">Deployment Preparation: </w:t>
+        <w:t xml:space="preserve">Deployment: </w:t>
       </w:r>
       <w:r>
         <w:rPr>
@@ -1736,7 +1734,7 @@
           <w:color w:val="222222"/>
           <w:sz w:val="21"/>
         </w:rPr>
-        <w:t>A production Vite build and a server that can serve the built client; GitHub publication and Render verification are pending.</w:t>
+        <w:t>A production Vite build served by Express on Render at https://campusbudget-jztx.onrender.com, with source code published on GitHub.</w:t>
       </w:r>
     </w:p>
     <w:p>
@@ -2453,7 +2451,7 @@
           <w:color w:val="222222"/>
           <w:sz w:val="21"/>
         </w:rPr>
-        <w:t>Ran five backend tests and a production client build. Connected to Atlas and ran an integration script covering authentication, validation, CRUD, filters, budget totals, and ownership. Completed a browser walkthrough. GitHub publication, Render deployment, mobile and keyboard review, and live checks remain to be done.</w:t>
+        <w:t>Ran five backend tests and a production client build. Atlas integration covered authentication, validation, CRUD, filters, budget totals, and ownership. Published the GitHub repository and deployed one Node web service on Render. The live browser walkthrough passed registration, budget save, expense create/edit/delete, search, totals, and budget-card navigation. Mobile and keyboard review remain.</w:t>
       </w:r>
     </w:p>
     <w:p>
@@ -2844,7 +2842,7 @@
                 <w:color w:val="222222"/>
                 <w:sz w:val="18"/>
               </w:rPr>
-              <w:t>Registration, ₹5,000 budget save, ₹120.50 expense creation, and ₹4,879.50 remainder observed.</w:t>
+              <w:t>Live registration, ₹5,000 budget, expense create/edit/delete/search, and dashboard totals passed.</w:t>
             </w:r>
           </w:p>
         </w:tc>
@@ -3004,7 +3002,7 @@
                 <w:color w:val="222222"/>
                 <w:sz w:val="18"/>
               </w:rPr>
-              <w:t>Pending publication and hosted verification; no live result is claimed.</w:t>
+              <w:t>Public GitHub and Render site are live; Atlas connected and core flows passed.</w:t>
             </w:r>
           </w:p>
         </w:tc>
@@ -3156,7 +3154,7 @@
           <w:color w:val="222222"/>
           <w:sz w:val="21"/>
         </w:rPr>
-        <w:t>CampusBudget</w:t>
+        <w:t>CampusBudget demonstrates a deployed MERN flow for private student expense tracking. React displays the interface; Express validates and authorises requests; MongoDB Atlas stores records; and the monthly summary compares expenses with the budget. Local tests, Atlas integration, and live browser checks support these conclusions.</w:t>
       </w:r>
       <w:proofErr w:type="spellEnd"/>
       <w:r>
@@ -3165,7 +3163,6 @@
           <w:color w:val="222222"/>
           <w:sz w:val="21"/>
         </w:rPr>
-        <w:t xml:space="preserve"> demonstrates a complete local MERN flow for private student expense tracking. React displays the interface; Express validates and </w:t>
       </w:r>
       <w:proofErr w:type="spellStart"/>
       <w:r>
@@ -3174,7 +3171,6 @@
           <w:color w:val="222222"/>
           <w:sz w:val="21"/>
         </w:rPr>
-        <w:t>authorises</w:t>
       </w:r>
       <w:proofErr w:type="spellEnd"/>
       <w:r>
@@ -3183,7 +3179,6 @@
           <w:color w:val="222222"/>
           <w:sz w:val="21"/>
         </w:rPr>
-        <w:t xml:space="preserve"> requests; MongoDB Atlas stores the records; and the monthly summary turns expense entries into a clear budget comparison. Local tests and a browser walkthrough support these conclusions.</w:t>
       </w:r>
     </w:p>
     <w:p>
@@ -3196,7 +3191,7 @@
           <w:color w:val="222222"/>
           <w:sz w:val="21"/>
         </w:rPr>
-        <w:t>The work strengthened practical understanding of React state, REST APIs, Mongoose schema design, authentication, and validation. The remaining submission tasks are GitHub publication, Render deployment, live-site testing, screenshots, and updating the report with those actual results.</w:t>
+        <w:t>The work strengthened practical understanding of React state, REST APIs, Mongoose schema design, authentication, validation, GitHub, and Render. Remaining work is final screenshots, mobile and keyboard review, and proofreading.</w:t>
       </w:r>
     </w:p>
     <w:p>

</xml_diff>